<commit_message>
One line per series in time series figures, scan line added, Dallas running WDD against the scan
- Time series figures show a single three-month moving average per series
  (no separate thin monthly lines) and now include the scan's network circle.
- New Dallas running WDD chart against the scan area, in the scan's color.

Co-Authored-By: Claude Opus 5.5 <noreply@anthropic.com>
</commit_message>
<xml_diff>
--- a/paper.docx
+++ b/paper.docx
@@ -9983,7 +9983,7 @@
             <w:r>
               <w:drawing>
                 <wp:inline>
-                  <wp:extent cx="5334000" cy="2378675"/>
+                  <wp:extent cx="5334000" cy="2380820"/>
                   <wp:effectExtent b="0" l="0" r="0" t="0"/>
                   <wp:docPr descr="" title="" id="37" name="Picture"/>
                   <a:graphic>
@@ -10004,7 +10004,7 @@
                         <pic:spPr bwMode="auto">
                           <a:xfrm>
                             <a:off x="0" y="0"/>
-                            <a:ext cx="5334000" cy="2378675"/>
+                            <a:ext cx="5334000" cy="2380820"/>
                           </a:xfrm>
                           <a:prstGeom prst="rect">
                             <a:avLst/>
@@ -10033,7 +10033,7 @@
               <w:pStyle w:val="ImageCaption"/>
             </w:pPr>
             <w:r>
-              <w:t xml:space="preserve">Figure 2: Monthly crime in the example world’s treated area and in three controls, each scaled to the treated area’s pre-period volume. Thin lines are monthly counts, thick lines three-month moving averages computed separately before and after the intervention (dotted line). The treated area’s crime falls 20% after the intervention.</w:t>
+              <w:t xml:space="preserve">Figure 2: Monthly crime in the example world’s treated area and in four controls, each scaled to the treated area’s pre-period volume. Each line is a three-month moving average of monthly counts, computed separately before and after the intervention (dotted line). The treated area’s crime falls 20% after the intervention.</w:t>
             </w:r>
           </w:p>
           <w:bookmarkEnd w:id="39"/>
@@ -12044,7 +12044,7 @@
     </w:p>
     <w:bookmarkEnd w:id="42"/>
     <w:bookmarkEnd w:id="43"/>
-    <w:bookmarkStart w:id="53" w:name="sec-dallas"/>
+    <w:bookmarkStart w:id="57" w:name="sec-dallas"/>
     <w:p>
       <w:pPr>
         <w:pStyle w:val="Heading1"/>
@@ -12520,7 +12520,7 @@
               <w:pStyle w:val="ImageCaption"/>
             </w:pPr>
             <w:r>
-              <w:t xml:space="preserve">Figure 4: Monthly crime in the RedBird PID, its contiguous control area, and the microsynth control. Thin lines are monthly counts, thick lines three-month moving averages computed separately before and after January 1, 2026 (dotted line).</w:t>
+              <w:t xml:space="preserve">Figure 4: Monthly crime in the RedBird PID and three controls: the contiguous control area, the scan’s network circle, and microsynth. Each line is a three-month moving average of monthly counts, computed separately before and after January 1, 2026 (dotted line).</w:t>
             </w:r>
           </w:p>
           <w:bookmarkEnd w:id="51"/>
@@ -14295,13 +14295,31 @@
         <w:t xml:space="preserve"> </w:t>
       </w:r>
       <w:r>
-        <w:t xml:space="preserve">Microsynth’s weighted series reproduces the district’s monthly counts</w:t>
-      </w:r>
-      <w:r>
-        <w:t xml:space="preserve"> </w:t>
-      </w:r>
-      <w:r>
-        <w:t xml:space="preserve">exactly (its line lies under the treated area’s before 2026).</w:t>
+        <w:t xml:space="preserve">The scan’s network circles, which also pass the checks (violations of</w:t>
+      </w:r>
+      <w:r>
+        <w:t xml:space="preserve"> </w:t>
+      </w:r>
+      <w:r>
+        <w:t xml:space="preserve">0.99 and</w:t>
+      </w:r>
+      <w:r>
+        <w:t xml:space="preserve"> </w:t>
+      </w:r>
+      <w:r>
+        <w:t xml:space="preserve">0.97), track it about as</w:t>
+      </w:r>
+      <w:r>
+        <w:t xml:space="preserve"> </w:t>
+      </w:r>
+      <w:r>
+        <w:t xml:space="preserve">closely. Microsynth’s weighted series reproduces the district’s monthly</w:t>
+      </w:r>
+      <w:r>
+        <w:t xml:space="preserve"> </w:t>
+      </w:r>
+      <w:r>
+        <w:t xml:space="preserve">counts exactly (its line lies under the treated area’s before 2026).</w:t>
       </w:r>
     </w:p>
     <w:p>
@@ -14481,232 +14499,6 @@
       </w:r>
       <w:r>
         <w:t xml:space="preserve">included, is what the simulations show produces erratic estimates.</w:t>
-      </w:r>
-    </w:p>
-    <w:bookmarkEnd w:id="53"/>
-    <w:bookmarkStart w:id="67" w:name="sec-nyc"/>
-    <w:p>
-      <w:pPr>
-        <w:pStyle w:val="Heading1"/>
-      </w:pPr>
-      <w:r>
-        <w:t xml:space="preserve">6. Case study 2: Operation Restore Roosevelt, Queens</w:t>
-      </w:r>
-    </w:p>
-    <w:p>
-      <w:pPr>
-        <w:pStyle w:val="FirstParagraph"/>
-      </w:pPr>
-      <w:r>
-        <w:t xml:space="preserve">Operation Restore Roosevelt began on October 15, 2024: a 90-day,</w:t>
-      </w:r>
-      <w:r>
-        <w:t xml:space="preserve"> </w:t>
-      </w:r>
-      <w:r>
-        <w:t xml:space="preserve">multi-agency enforcement push by the New York Police Department, with state</w:t>
-      </w:r>
-      <w:r>
-        <w:t xml:space="preserve"> </w:t>
-      </w:r>
-      <w:r>
-        <w:t xml:space="preserve">troopers, on Roosevelt Avenue from 74th Street to 111th Street in Jackson</w:t>
-      </w:r>
-      <w:r>
-        <w:t xml:space="preserve"> </w:t>
-      </w:r>
-      <w:r>
-        <w:t xml:space="preserve">Heights, Elmhurst, and Corona, Queens, aimed at brothels, illegal street</w:t>
-      </w:r>
-      <w:r>
-        <w:t xml:space="preserve"> </w:t>
-      </w:r>
-      <w:r>
-        <w:t xml:space="preserve">vending, retail theft and the sale of stolen goods, and unlicensed vehicles</w:t>
-      </w:r>
-      <w:r>
-        <w:t xml:space="preserve"> </w:t>
-      </w:r>
-      <w:r>
-        <w:t xml:space="preserve">(</w:t>
-      </w:r>
-      <w:hyperlink w:anchor="ref-queenseagle2024">
-        <w:r>
-          <w:rPr>
-            <w:rStyle w:val="Hyperlink"/>
-          </w:rPr>
-          <w:t xml:space="preserve">Queens Daily Eagle 2024</w:t>
-        </w:r>
-      </w:hyperlink>
-      <w:r>
-        <w:t xml:space="preserve">;</w:t>
-      </w:r>
-      <w:r>
-        <w:t xml:space="preserve"> </w:t>
-      </w:r>
-      <w:hyperlink w:anchor="ref-nyc2024roosevelt">
-        <w:r>
-          <w:rPr>
-            <w:rStyle w:val="Hyperlink"/>
-          </w:rPr>
-          <w:t xml:space="preserve">City of New York, Office of the Mayor 2024</w:t>
-        </w:r>
-      </w:hyperlink>
-      <w:r>
-        <w:t xml:space="preserve">)</w:t>
-      </w:r>
-      <w:r>
-        <w:t xml:space="preserve">. The city’s announcement also notes</w:t>
-      </w:r>
-      <w:r>
-        <w:t xml:space="preserve"> </w:t>
-      </w:r>
-      <w:r>
-        <w:t xml:space="preserve">that over the preceding year the police had already been addressing</w:t>
-      </w:r>
-      <w:r>
-        <w:t xml:space="preserve"> </w:t>
-      </w:r>
-      <w:r>
-        <w:t xml:space="preserve">prostitution, unlicensed vending, and retail theft on the corridor</w:t>
-      </w:r>
-      <w:r>
-        <w:t xml:space="preserve"> </w:t>
-      </w:r>
-      <w:r>
-        <w:t xml:space="preserve">(</w:t>
-      </w:r>
-      <w:hyperlink w:anchor="ref-nyc2024roosevelt">
-        <w:r>
-          <w:rPr>
-            <w:rStyle w:val="Hyperlink"/>
-          </w:rPr>
-          <w:t xml:space="preserve">City of New York, Office of the Mayor 2024</w:t>
-        </w:r>
-      </w:hyperlink>
-      <w:r>
-        <w:t xml:space="preserve">)</w:t>
-      </w:r>
-      <w:r>
-        <w:t xml:space="preserve">, so the operation intensified enforcement that had been</w:t>
-      </w:r>
-      <w:r>
-        <w:t xml:space="preserve"> </w:t>
-      </w:r>
-      <w:r>
-        <w:t xml:space="preserve">building. It was extended after the first 90 days. In January 2025 the</w:t>
-      </w:r>
-      <w:r>
-        <w:t xml:space="preserve"> </w:t>
-      </w:r>
-      <w:r>
-        <w:t xml:space="preserve">police commissioner credited it with a 25% reduction in crime in the area</w:t>
-      </w:r>
-      <w:r>
-        <w:t xml:space="preserve"> </w:t>
-      </w:r>
-      <w:r>
-        <w:t xml:space="preserve">(</w:t>
-      </w:r>
-      <w:hyperlink w:anchor="ref-qns2025">
-        <w:r>
-          <w:rPr>
-            <w:rStyle w:val="Hyperlink"/>
-          </w:rPr>
-          <w:t xml:space="preserve">QNS 2025</w:t>
-        </w:r>
-      </w:hyperlink>
-      <w:r>
-        <w:t xml:space="preserve">)</w:t>
-      </w:r>
-      <w:r>
-        <w:t xml:space="preserve">.</w:t>
-      </w:r>
-    </w:p>
-    <w:p>
-      <w:pPr>
-        <w:pStyle w:val="BodyText"/>
-      </w:pPr>
-      <w:r>
-        <w:t xml:space="preserve">I use NYPD complaint records for Queens from the city’s open data portal</w:t>
-      </w:r>
-      <w:r>
-        <w:t xml:space="preserve"> </w:t>
-      </w:r>
-      <w:r>
-        <w:t xml:space="preserve">(the historic file through 2025 and the year-to-date file through June</w:t>
-      </w:r>
-      <w:r>
-        <w:t xml:space="preserve"> </w:t>
-      </w:r>
-      <w:r>
-        <w:t xml:space="preserve">2026). Violent crime is murder, robbery, and felony assault; property crime</w:t>
-      </w:r>
-      <w:r>
-        <w:t xml:space="preserve"> </w:t>
-      </w:r>
-      <w:r>
-        <w:t xml:space="preserve">is burglary, grand and petit larceny, and motor vehicle theft. Complaints</w:t>
-      </w:r>
-      <w:r>
-        <w:t xml:space="preserve"> </w:t>
-      </w:r>
-      <w:r>
-        <w:t xml:space="preserve">are assigned to the 13,926 2020 census blocks with</w:t>
-      </w:r>
-      <w:r>
-        <w:t xml:space="preserve"> </w:t>
-      </w:r>
-      <w:r>
-        <w:t xml:space="preserve">land area in Queens. The treated area is the TIGER centerline of Roosevelt</w:t>
-      </w:r>
-      <w:r>
-        <w:t xml:space="preserve"> </w:t>
-      </w:r>
-      <w:r>
-        <w:t xml:space="preserve">Avenue between the two cross streets, about two miles, buffered by 250 feet</w:t>
-      </w:r>
-      <w:r>
-        <w:t xml:space="preserve"> </w:t>
-      </w:r>
-      <w:r>
-        <w:t xml:space="preserve">to take in the avenue and the buildings fronting it. In the year before the</w:t>
-      </w:r>
-      <w:r>
-        <w:t xml:space="preserve"> </w:t>
-      </w:r>
-      <w:r>
-        <w:t xml:space="preserve">operation it had 462 violent and</w:t>
-      </w:r>
-      <w:r>
-        <w:t xml:space="preserve"> </w:t>
-      </w:r>
-      <w:r>
-        <w:t xml:space="preserve">824 property complaints. Months run from</w:t>
-      </w:r>
-      <w:r>
-        <w:t xml:space="preserve"> </w:t>
-      </w:r>
-      <w:r>
-        <w:t xml:space="preserve">the 15th to the 14th. The search matches the 72 months</w:t>
-      </w:r>
-      <w:r>
-        <w:t xml:space="preserve"> </w:t>
-      </w:r>
-      <w:r>
-        <w:t xml:space="preserve">before the launch (October 15, 2018 to October 14, 2024), blocks within a</w:t>
-      </w:r>
-      <w:r>
-        <w:t xml:space="preserve"> </w:t>
-      </w:r>
-      <w:r>
-        <w:t xml:space="preserve">quarter mile of the corridor are excluded, and the WDD compares the 20</w:t>
-      </w:r>
-      <w:r>
-        <w:t xml:space="preserve"> </w:t>
-      </w:r>
-      <w:r>
-        <w:t xml:space="preserve">months after the launch, through June 14, 2026, with the 20 months before.</w:t>
       </w:r>
     </w:p>
     <w:tbl>
@@ -14723,7 +14515,394 @@
       <w:tr>
         <w:tc>
           <w:tcPr/>
-          <w:bookmarkStart w:id="57" w:name="fig-nyc-map"/>
+          <w:bookmarkStart w:id="56" w:name="fig-dallas-cumulative"/>
+          <w:p>
+            <w:pPr>
+              <w:pStyle w:val="Compact"/>
+              <w:jc w:val="center"/>
+            </w:pPr>
+            <w:r>
+              <w:drawing>
+                <wp:inline>
+                  <wp:extent cx="5334000" cy="2306594"/>
+                  <wp:effectExtent b="0" l="0" r="0" t="0"/>
+                  <wp:docPr descr="" title="" id="54" name="Picture"/>
+                  <a:graphic>
+                    <a:graphicData uri="http://schemas.openxmlformats.org/drawingml/2006/picture">
+                      <pic:pic>
+                        <pic:nvPicPr>
+                          <pic:cNvPr descr="paper_files/figure-docx/fig-dallas-cumulative-output-1.png" id="55" name="Picture"/>
+                          <pic:cNvPicPr>
+                            <a:picLocks noChangeArrowheads="1" noChangeAspect="1"/>
+                          </pic:cNvPicPr>
+                        </pic:nvPicPr>
+                        <pic:blipFill>
+                          <a:blip r:embed="rId53"/>
+                          <a:stretch>
+                            <a:fillRect/>
+                          </a:stretch>
+                        </pic:blipFill>
+                        <pic:spPr bwMode="auto">
+                          <a:xfrm>
+                            <a:off x="0" y="0"/>
+                            <a:ext cx="5334000" cy="2306594"/>
+                          </a:xfrm>
+                          <a:prstGeom prst="rect">
+                            <a:avLst/>
+                          </a:prstGeom>
+                          <a:noFill/>
+                          <a:ln w="9525">
+                            <a:noFill/>
+                            <a:headEnd/>
+                            <a:tailEnd/>
+                          </a:ln>
+                        </pic:spPr>
+                      </pic:pic>
+                    </a:graphicData>
+                  </a:graphic>
+                </wp:inline>
+              </w:drawing>
+            </w:r>
+          </w:p>
+          <w:p>
+            <w:pPr>
+              <w:jc w:val="center"/>
+            </w:pPr>
+            <w:pPr>
+              <w:jc w:val="start"/>
+              <w:spacing w:before="200"/>
+              <w:pStyle w:val="ImageCaption"/>
+            </w:pPr>
+            <w:r>
+              <w:t xml:space="preserve">Figure 5: Running WDD estimate of crimes prevented (negative) or added (positive) in the RedBird PID relative to the scan’s network circle, by month since January 1, 2026. The shaded band is the 95% confidence interval of the estimate. The baseline is the nine months before January 2026.</w:t>
+            </w:r>
+          </w:p>
+          <w:bookmarkEnd w:id="56"/>
+        </w:tc>
+      </w:tr>
+    </w:tbl>
+    <w:p>
+      <w:pPr>
+        <w:pStyle w:val="BodyText"/>
+      </w:pPr>
+      <w:r>
+        <w:t xml:space="preserve">The running WDD works with any control area.</w:t>
+      </w:r>
+      <w:r>
+        <w:t xml:space="preserve"> </w:t>
+      </w:r>
+      <w:hyperlink w:anchor="fig-dallas-cumulative">
+        <w:r>
+          <w:rPr>
+            <w:rStyle w:val="Hyperlink"/>
+          </w:rPr>
+          <w:t xml:space="preserve">Figure 5</w:t>
+        </w:r>
+      </w:hyperlink>
+      <w:r>
+        <w:t xml:space="preserve"> </w:t>
+      </w:r>
+      <w:r>
+        <w:t xml:space="preserve">tracks</w:t>
+      </w:r>
+      <w:r>
+        <w:t xml:space="preserve"> </w:t>
+      </w:r>
+      <w:r>
+        <w:t xml:space="preserve">the district month by month against the scan’s network circle. Violent</w:t>
+      </w:r>
+      <w:r>
+        <w:t xml:space="preserve"> </w:t>
+      </w:r>
+      <w:r>
+        <w:t xml:space="preserve">crime never strays more than</w:t>
+      </w:r>
+      <w:r>
+        <w:t xml:space="preserve"> </w:t>
+      </w:r>
+      <w:r>
+        <w:t xml:space="preserve">3 crimes from its control’s path and</w:t>
+      </w:r>
+      <w:r>
+        <w:t xml:space="preserve"> </w:t>
+      </w:r>
+      <w:r>
+        <w:t xml:space="preserve">ends at -3; property crime moves between</w:t>
+      </w:r>
+      <w:r>
+        <w:t xml:space="preserve"> </w:t>
+      </w:r>
+      <w:r>
+        <w:t xml:space="preserve">-14 and +13</w:t>
+      </w:r>
+      <w:r>
+        <w:t xml:space="preserve"> </w:t>
+      </w:r>
+      <w:r>
+        <w:t xml:space="preserve">and ends at +13. Neither interval excludes zero</w:t>
+      </w:r>
+      <w:r>
+        <w:t xml:space="preserve"> </w:t>
+      </w:r>
+      <w:r>
+        <w:t xml:space="preserve">in any month, the same answer as the contiguous control in</w:t>
+      </w:r>
+      <w:r>
+        <w:t xml:space="preserve"> </w:t>
+      </w:r>
+      <w:hyperlink w:anchor="tbl-dallas">
+        <w:r>
+          <w:rPr>
+            <w:rStyle w:val="Hyperlink"/>
+          </w:rPr>
+          <w:t xml:space="preserve">Table 2</w:t>
+        </w:r>
+      </w:hyperlink>
+      <w:r>
+        <w:t xml:space="preserve">.</w:t>
+      </w:r>
+    </w:p>
+    <w:bookmarkEnd w:id="57"/>
+    <w:bookmarkStart w:id="71" w:name="sec-nyc"/>
+    <w:p>
+      <w:pPr>
+        <w:pStyle w:val="Heading1"/>
+      </w:pPr>
+      <w:r>
+        <w:t xml:space="preserve">6. Case study 2: Operation Restore Roosevelt, Queens</w:t>
+      </w:r>
+    </w:p>
+    <w:p>
+      <w:pPr>
+        <w:pStyle w:val="FirstParagraph"/>
+      </w:pPr>
+      <w:r>
+        <w:t xml:space="preserve">Operation Restore Roosevelt began on October 15, 2024: a 90-day,</w:t>
+      </w:r>
+      <w:r>
+        <w:t xml:space="preserve"> </w:t>
+      </w:r>
+      <w:r>
+        <w:t xml:space="preserve">multi-agency enforcement push by the New York Police Department, with state</w:t>
+      </w:r>
+      <w:r>
+        <w:t xml:space="preserve"> </w:t>
+      </w:r>
+      <w:r>
+        <w:t xml:space="preserve">troopers, on Roosevelt Avenue from 74th Street to 111th Street in Jackson</w:t>
+      </w:r>
+      <w:r>
+        <w:t xml:space="preserve"> </w:t>
+      </w:r>
+      <w:r>
+        <w:t xml:space="preserve">Heights, Elmhurst, and Corona, Queens, aimed at brothels, illegal street</w:t>
+      </w:r>
+      <w:r>
+        <w:t xml:space="preserve"> </w:t>
+      </w:r>
+      <w:r>
+        <w:t xml:space="preserve">vending, retail theft and the sale of stolen goods, and unlicensed vehicles</w:t>
+      </w:r>
+      <w:r>
+        <w:t xml:space="preserve"> </w:t>
+      </w:r>
+      <w:r>
+        <w:t xml:space="preserve">(</w:t>
+      </w:r>
+      <w:hyperlink w:anchor="ref-queenseagle2024">
+        <w:r>
+          <w:rPr>
+            <w:rStyle w:val="Hyperlink"/>
+          </w:rPr>
+          <w:t xml:space="preserve">Queens Daily Eagle 2024</w:t>
+        </w:r>
+      </w:hyperlink>
+      <w:r>
+        <w:t xml:space="preserve">;</w:t>
+      </w:r>
+      <w:r>
+        <w:t xml:space="preserve"> </w:t>
+      </w:r>
+      <w:hyperlink w:anchor="ref-nyc2024roosevelt">
+        <w:r>
+          <w:rPr>
+            <w:rStyle w:val="Hyperlink"/>
+          </w:rPr>
+          <w:t xml:space="preserve">City of New York, Office of the Mayor 2024</w:t>
+        </w:r>
+      </w:hyperlink>
+      <w:r>
+        <w:t xml:space="preserve">)</w:t>
+      </w:r>
+      <w:r>
+        <w:t xml:space="preserve">. The city’s announcement also notes</w:t>
+      </w:r>
+      <w:r>
+        <w:t xml:space="preserve"> </w:t>
+      </w:r>
+      <w:r>
+        <w:t xml:space="preserve">that over the preceding year the police had already been addressing</w:t>
+      </w:r>
+      <w:r>
+        <w:t xml:space="preserve"> </w:t>
+      </w:r>
+      <w:r>
+        <w:t xml:space="preserve">prostitution, unlicensed vending, and retail theft on the corridor</w:t>
+      </w:r>
+      <w:r>
+        <w:t xml:space="preserve"> </w:t>
+      </w:r>
+      <w:r>
+        <w:t xml:space="preserve">(</w:t>
+      </w:r>
+      <w:hyperlink w:anchor="ref-nyc2024roosevelt">
+        <w:r>
+          <w:rPr>
+            <w:rStyle w:val="Hyperlink"/>
+          </w:rPr>
+          <w:t xml:space="preserve">City of New York, Office of the Mayor 2024</w:t>
+        </w:r>
+      </w:hyperlink>
+      <w:r>
+        <w:t xml:space="preserve">)</w:t>
+      </w:r>
+      <w:r>
+        <w:t xml:space="preserve">, so the operation intensified enforcement that had been</w:t>
+      </w:r>
+      <w:r>
+        <w:t xml:space="preserve"> </w:t>
+      </w:r>
+      <w:r>
+        <w:t xml:space="preserve">building. It was extended after the first 90 days. In January 2025 the</w:t>
+      </w:r>
+      <w:r>
+        <w:t xml:space="preserve"> </w:t>
+      </w:r>
+      <w:r>
+        <w:t xml:space="preserve">police commissioner credited it with a 25% reduction in crime in the area</w:t>
+      </w:r>
+      <w:r>
+        <w:t xml:space="preserve"> </w:t>
+      </w:r>
+      <w:r>
+        <w:t xml:space="preserve">(</w:t>
+      </w:r>
+      <w:hyperlink w:anchor="ref-qns2025">
+        <w:r>
+          <w:rPr>
+            <w:rStyle w:val="Hyperlink"/>
+          </w:rPr>
+          <w:t xml:space="preserve">QNS 2025</w:t>
+        </w:r>
+      </w:hyperlink>
+      <w:r>
+        <w:t xml:space="preserve">)</w:t>
+      </w:r>
+      <w:r>
+        <w:t xml:space="preserve">.</w:t>
+      </w:r>
+    </w:p>
+    <w:p>
+      <w:pPr>
+        <w:pStyle w:val="BodyText"/>
+      </w:pPr>
+      <w:r>
+        <w:t xml:space="preserve">I use NYPD complaint records for Queens from the city’s open data portal</w:t>
+      </w:r>
+      <w:r>
+        <w:t xml:space="preserve"> </w:t>
+      </w:r>
+      <w:r>
+        <w:t xml:space="preserve">(the historic file through 2025 and the year-to-date file through June</w:t>
+      </w:r>
+      <w:r>
+        <w:t xml:space="preserve"> </w:t>
+      </w:r>
+      <w:r>
+        <w:t xml:space="preserve">2026). Violent crime is murder, robbery, and felony assault; property crime</w:t>
+      </w:r>
+      <w:r>
+        <w:t xml:space="preserve"> </w:t>
+      </w:r>
+      <w:r>
+        <w:t xml:space="preserve">is burglary, grand and petit larceny, and motor vehicle theft. Complaints</w:t>
+      </w:r>
+      <w:r>
+        <w:t xml:space="preserve"> </w:t>
+      </w:r>
+      <w:r>
+        <w:t xml:space="preserve">are assigned to the 13,926 2020 census blocks with</w:t>
+      </w:r>
+      <w:r>
+        <w:t xml:space="preserve"> </w:t>
+      </w:r>
+      <w:r>
+        <w:t xml:space="preserve">land area in Queens. The treated area is the TIGER centerline of Roosevelt</w:t>
+      </w:r>
+      <w:r>
+        <w:t xml:space="preserve"> </w:t>
+      </w:r>
+      <w:r>
+        <w:t xml:space="preserve">Avenue between the two cross streets, about two miles, buffered by 250 feet</w:t>
+      </w:r>
+      <w:r>
+        <w:t xml:space="preserve"> </w:t>
+      </w:r>
+      <w:r>
+        <w:t xml:space="preserve">to take in the avenue and the buildings fronting it. In the year before the</w:t>
+      </w:r>
+      <w:r>
+        <w:t xml:space="preserve"> </w:t>
+      </w:r>
+      <w:r>
+        <w:t xml:space="preserve">operation it had 462 violent and</w:t>
+      </w:r>
+      <w:r>
+        <w:t xml:space="preserve"> </w:t>
+      </w:r>
+      <w:r>
+        <w:t xml:space="preserve">824 property complaints. Months run from</w:t>
+      </w:r>
+      <w:r>
+        <w:t xml:space="preserve"> </w:t>
+      </w:r>
+      <w:r>
+        <w:t xml:space="preserve">the 15th to the 14th. The search matches the 72 months</w:t>
+      </w:r>
+      <w:r>
+        <w:t xml:space="preserve"> </w:t>
+      </w:r>
+      <w:r>
+        <w:t xml:space="preserve">before the launch (October 15, 2018 to October 14, 2024), blocks within a</w:t>
+      </w:r>
+      <w:r>
+        <w:t xml:space="preserve"> </w:t>
+      </w:r>
+      <w:r>
+        <w:t xml:space="preserve">quarter mile of the corridor are excluded, and the WDD compares the 20</w:t>
+      </w:r>
+      <w:r>
+        <w:t xml:space="preserve"> </w:t>
+      </w:r>
+      <w:r>
+        <w:t xml:space="preserve">months after the launch, through June 14, 2026, with the 20 months before.</w:t>
+      </w:r>
+    </w:p>
+    <w:tbl>
+      <w:tblPr>
+        <w:tblStyle w:val="Table"/>
+        <w:tblW w:type="pct" w:w="5000"/>
+        <w:tblLook w:firstRow="0" w:lastRow="0" w:firstColumn="0" w:lastColumn="0" w:noHBand="0" w:noVBand="0" w:val="0000"/>
+        <w:jc w:val="start"/>
+        <w:tblLayout w:type="fixed"/>
+      </w:tblPr>
+      <w:tblGrid>
+        <w:gridCol w:w="7920"/>
+      </w:tblGrid>
+      <w:tr>
+        <w:tc>
+          <w:tcPr/>
+          <w:bookmarkStart w:id="61" w:name="fig-nyc-map"/>
           <w:p>
             <w:pPr>
               <w:pStyle w:val="Compact"/>
@@ -14734,18 +14913,18 @@
                 <wp:inline>
                   <wp:extent cx="5334000" cy="5986284"/>
                   <wp:effectExtent b="0" l="0" r="0" t="0"/>
-                  <wp:docPr descr="" title="" id="55" name="Picture"/>
+                  <wp:docPr descr="" title="" id="59" name="Picture"/>
                   <a:graphic>
                     <a:graphicData uri="http://schemas.openxmlformats.org/drawingml/2006/picture">
                       <pic:pic>
                         <pic:nvPicPr>
-                          <pic:cNvPr descr="paper_files/figure-docx/fig-nyc-map-output-1.png" id="56" name="Picture"/>
+                          <pic:cNvPr descr="paper_files/figure-docx/fig-nyc-map-output-1.png" id="60" name="Picture"/>
                           <pic:cNvPicPr>
                             <a:picLocks noChangeArrowheads="1" noChangeAspect="1"/>
                           </pic:cNvPicPr>
                         </pic:nvPicPr>
                         <pic:blipFill>
-                          <a:blip r:embed="rId54"/>
+                          <a:blip r:embed="rId58"/>
                           <a:stretch>
                             <a:fillRect/>
                           </a:stretch>
@@ -14782,10 +14961,10 @@
               <w:pStyle w:val="ImageCaption"/>
             </w:pPr>
             <w:r>
-              <w:t xml:space="preserve">Figure 5: Roosevelt Avenue from 74th to 111th Street (black), its quarter-mile buffer (dashed), and the control areas for violent and property crime: the contiguous control (blue fill) and the pure scan’s network circle (aqua outline). Gray lines are census blocks.</w:t>
+              <w:t xml:space="preserve">Figure 6: Roosevelt Avenue from 74th to 111th Street (black), its quarter-mile buffer (dashed), and the control areas for violent and property crime: the contiguous control (blue fill) and the pure scan’s network circle (aqua outline). Gray lines are census blocks.</w:t>
             </w:r>
           </w:p>
-          <w:bookmarkEnd w:id="57"/>
+          <w:bookmarkEnd w:id="61"/>
         </w:tc>
       </w:tr>
     </w:tbl>
@@ -14803,7 +14982,7 @@
       <w:tr>
         <w:tc>
           <w:tcPr/>
-          <w:bookmarkStart w:id="61" w:name="fig-nyc-series"/>
+          <w:bookmarkStart w:id="65" w:name="fig-nyc-series"/>
           <w:p>
             <w:pPr>
               <w:pStyle w:val="Compact"/>
@@ -14814,18 +14993,18 @@
                 <wp:inline>
                   <wp:extent cx="5334000" cy="4108621"/>
                   <wp:effectExtent b="0" l="0" r="0" t="0"/>
-                  <wp:docPr descr="" title="" id="59" name="Picture"/>
+                  <wp:docPr descr="" title="" id="63" name="Picture"/>
                   <a:graphic>
                     <a:graphicData uri="http://schemas.openxmlformats.org/drawingml/2006/picture">
                       <pic:pic>
                         <pic:nvPicPr>
-                          <pic:cNvPr descr="paper_files/figure-docx/fig-nyc-series-output-1.png" id="60" name="Picture"/>
+                          <pic:cNvPr descr="paper_files/figure-docx/fig-nyc-series-output-1.png" id="64" name="Picture"/>
                           <pic:cNvPicPr>
                             <a:picLocks noChangeArrowheads="1" noChangeAspect="1"/>
                           </pic:cNvPicPr>
                         </pic:nvPicPr>
                         <pic:blipFill>
-                          <a:blip r:embed="rId58"/>
+                          <a:blip r:embed="rId62"/>
                           <a:stretch>
                             <a:fillRect/>
                           </a:stretch>
@@ -14862,10 +15041,10 @@
               <w:pStyle w:val="ImageCaption"/>
             </w:pPr>
             <w:r>
-              <w:t xml:space="preserve">Figure 6: Monthly crime on the Roosevelt Avenue corridor, its contiguous control area, and the microsynth control. Thin lines are monthly counts, thick lines three-month moving averages computed separately before and after October 15, 2024 (dotted line).</w:t>
+              <w:t xml:space="preserve">Figure 7: Monthly crime on the Roosevelt Avenue corridor and three controls: the contiguous control area, the scan’s network circle, and microsynth. Each line is a three-month moving average of monthly counts, computed separately before and after October 15, 2024 (dotted line).</w:t>
             </w:r>
           </w:p>
-          <w:bookmarkEnd w:id="61"/>
+          <w:bookmarkEnd w:id="65"/>
         </w:tc>
       </w:tr>
     </w:tbl>
@@ -14883,7 +15062,7 @@
       <w:tr>
         <w:tc>
           <w:tcPr/>
-          <w:bookmarkStart w:id="62" w:name="tbl-nyc"/>
+          <w:bookmarkStart w:id="66" w:name="tbl-nyc"/>
           <w:p>
             <w:pPr>
               <w:jc w:val="center"/>
@@ -16481,7 +16660,7 @@
               </w:tc>
             </w:tr>
           </w:tbl>
-          <w:bookmarkEnd w:id="62"/>
+          <w:bookmarkEnd w:id="66"/>
           <w:p/>
         </w:tc>
       </w:tr>
@@ -16500,7 +16679,7 @@
       <w:tr>
         <w:tc>
           <w:tcPr/>
-          <w:bookmarkStart w:id="66" w:name="fig-nyc-cumulative"/>
+          <w:bookmarkStart w:id="70" w:name="fig-nyc-cumulative"/>
           <w:p>
             <w:pPr>
               <w:pStyle w:val="Compact"/>
@@ -16511,18 +16690,18 @@
                 <wp:inline>
                   <wp:extent cx="5334000" cy="2450756"/>
                   <wp:effectExtent b="0" l="0" r="0" t="0"/>
-                  <wp:docPr descr="" title="" id="64" name="Picture"/>
+                  <wp:docPr descr="" title="" id="68" name="Picture"/>
                   <a:graphic>
                     <a:graphicData uri="http://schemas.openxmlformats.org/drawingml/2006/picture">
                       <pic:pic>
                         <pic:nvPicPr>
-                          <pic:cNvPr descr="paper_files/figure-docx/fig-nyc-cumulative-output-1.png" id="65" name="Picture"/>
+                          <pic:cNvPr descr="paper_files/figure-docx/fig-nyc-cumulative-output-1.png" id="69" name="Picture"/>
                           <pic:cNvPicPr>
                             <a:picLocks noChangeArrowheads="1" noChangeAspect="1"/>
                           </pic:cNvPicPr>
                         </pic:nvPicPr>
                         <pic:blipFill>
-                          <a:blip r:embed="rId63"/>
+                          <a:blip r:embed="rId67"/>
                           <a:stretch>
                             <a:fillRect/>
                           </a:stretch>
@@ -16559,10 +16738,10 @@
               <w:pStyle w:val="ImageCaption"/>
             </w:pPr>
             <w:r>
-              <w:t xml:space="preserve">Figure 7: Running WDD estimate of crimes prevented (negative) or added (positive) on the Roosevelt Avenue corridor relative to its contiguous control area, by month since the operation began. The shaded band is the 95% confidence interval of the estimate. The baseline is the 20 months before the operation.</w:t>
+              <w:t xml:space="preserve">Figure 8: Running WDD estimate of crimes prevented (negative) or added (positive) on the Roosevelt Avenue corridor relative to its contiguous control area, by month since the operation began. The shaded band is the 95% confidence interval of the estimate. The baseline is the 20 months before the operation.</w:t>
             </w:r>
           </w:p>
-          <w:bookmarkEnd w:id="66"/>
+          <w:bookmarkEnd w:id="70"/>
         </w:tc>
       </w:tr>
     </w:tbl>
@@ -16596,7 +16775,7 @@
           <w:rPr>
             <w:rStyle w:val="Hyperlink"/>
           </w:rPr>
-          <w:t xml:space="preserve">Figure 5</w:t>
+          <w:t xml:space="preserve">Figure 6</w:t>
         </w:r>
       </w:hyperlink>
       <w:r>
@@ -16684,7 +16863,7 @@
           <w:rPr>
             <w:rStyle w:val="Hyperlink"/>
           </w:rPr>
-          <w:t xml:space="preserve">Figure 6</w:t>
+          <w:t xml:space="preserve">Figure 7</w:t>
         </w:r>
       </w:hyperlink>
       <w:r>
@@ -16721,7 +16900,25 @@
         <w:t xml:space="preserve"> </w:t>
       </w:r>
       <w:r>
-        <w:t xml:space="preserve">2022, and its control follows that too. The timing around the launch</w:t>
+        <w:t xml:space="preserve">2022, and its control follows that too; the scan’s network circle for</w:t>
+      </w:r>
+      <w:r>
+        <w:t xml:space="preserve"> </w:t>
+      </w:r>
+      <w:r>
+        <w:t xml:space="preserve">property crime, which fails the checks (violation</w:t>
+      </w:r>
+      <w:r>
+        <w:t xml:space="preserve"> </w:t>
+      </w:r>
+      <w:r>
+        <w:t xml:space="preserve">2.31), visibly departs from</w:t>
+      </w:r>
+      <w:r>
+        <w:t xml:space="preserve"> </w:t>
+      </w:r>
+      <w:r>
+        <w:t xml:space="preserve">the corridor in 2022 and 2023. The timing around the launch</w:t>
       </w:r>
       <w:r>
         <w:t xml:space="preserve"> </w:t>
@@ -16952,7 +17149,7 @@
           <w:rPr>
             <w:rStyle w:val="Hyperlink"/>
           </w:rPr>
-          <w:t xml:space="preserve">Figure 7</w:t>
+          <w:t xml:space="preserve">Figure 8</w:t>
         </w:r>
       </w:hyperlink>
       <w:r>
@@ -17124,8 +17321,8 @@
         <w:t xml:space="preserve">does not.</w:t>
       </w:r>
     </w:p>
-    <w:bookmarkEnd w:id="67"/>
-    <w:bookmarkStart w:id="69" w:name="sec-alt"/>
+    <w:bookmarkEnd w:id="71"/>
+    <w:bookmarkStart w:id="73" w:name="sec-alt"/>
     <w:p>
       <w:pPr>
         <w:pStyle w:val="Heading1"/>
@@ -17148,7 +17345,7 @@
       <w:tr>
         <w:tc>
           <w:tcPr/>
-          <w:bookmarkStart w:id="68" w:name="tbl-alt"/>
+          <w:bookmarkStart w:id="72" w:name="tbl-alt"/>
           <w:p>
             <w:pPr>
               <w:jc w:val="center"/>
@@ -19304,7 +19501,7 @@
               </w:tc>
             </w:tr>
           </w:tbl>
-          <w:bookmarkEnd w:id="68"/>
+          <w:bookmarkEnd w:id="72"/>
           <w:p/>
         </w:tc>
       </w:tr>
@@ -19566,8 +19763,8 @@
         <w:t xml:space="preserve">reductions a city-wide comparison suggests.</w:t>
       </w:r>
     </w:p>
-    <w:bookmarkEnd w:id="69"/>
-    <w:bookmarkStart w:id="70" w:name="discussion"/>
+    <w:bookmarkEnd w:id="73"/>
+    <w:bookmarkStart w:id="74" w:name="discussion"/>
     <w:p>
       <w:pPr>
         <w:pStyle w:val="Heading1"/>
@@ -19995,8 +20192,8 @@
         <w:t xml:space="preserve">segments, and any period length.</w:t>
       </w:r>
     </w:p>
-    <w:bookmarkEnd w:id="70"/>
-    <w:bookmarkStart w:id="71" w:name="ai-use-disclosure"/>
+    <w:bookmarkEnd w:id="74"/>
+    <w:bookmarkStart w:id="75" w:name="ai-use-disclosure"/>
     <w:p>
       <w:pPr>
         <w:pStyle w:val="Heading1"/>
@@ -20049,8 +20246,8 @@
         <w:t xml:space="preserve">are computed from the data and scripts in the repository.</w:t>
       </w:r>
     </w:p>
-    <w:bookmarkEnd w:id="71"/>
-    <w:bookmarkStart w:id="121" w:name="references"/>
+    <w:bookmarkEnd w:id="75"/>
+    <w:bookmarkStart w:id="125" w:name="references"/>
     <w:p>
       <w:pPr>
         <w:pStyle w:val="Heading1"/>
@@ -20059,8 +20256,8 @@
         <w:t xml:space="preserve">References</w:t>
       </w:r>
     </w:p>
-    <w:bookmarkStart w:id="120" w:name="refs"/>
-    <w:bookmarkStart w:id="73" w:name="ref-abadie2021"/>
+    <w:bookmarkStart w:id="124" w:name="refs"/>
+    <w:bookmarkStart w:id="77" w:name="ref-abadie2021"/>
     <w:p>
       <w:pPr>
         <w:pStyle w:val="Bibliography"/>
@@ -20093,7 +20290,7 @@
       <w:r>
         <w:t xml:space="preserve"> </w:t>
       </w:r>
-      <w:hyperlink r:id="rId72">
+      <w:hyperlink r:id="rId76">
         <w:r>
           <w:rPr>
             <w:rStyle w:val="Hyperlink"/>
@@ -20105,8 +20302,8 @@
         <w:t xml:space="preserve">.</w:t>
       </w:r>
     </w:p>
-    <w:bookmarkEnd w:id="73"/>
-    <w:bookmarkStart w:id="75" w:name="ref-abadie2010"/>
+    <w:bookmarkEnd w:id="77"/>
+    <w:bookmarkStart w:id="79" w:name="ref-abadie2010"/>
     <w:p>
       <w:pPr>
         <w:pStyle w:val="Bibliography"/>
@@ -20151,7 +20348,7 @@
       <w:r>
         <w:t xml:space="preserve"> </w:t>
       </w:r>
-      <w:hyperlink r:id="rId74">
+      <w:hyperlink r:id="rId78">
         <w:r>
           <w:rPr>
             <w:rStyle w:val="Hyperlink"/>
@@ -20163,8 +20360,8 @@
         <w:t xml:space="preserve">.</w:t>
       </w:r>
     </w:p>
-    <w:bookmarkEnd w:id="75"/>
-    <w:bookmarkStart w:id="77" w:name="ref-abadie2003"/>
+    <w:bookmarkEnd w:id="79"/>
+    <w:bookmarkStart w:id="81" w:name="ref-abadie2003"/>
     <w:p>
       <w:pPr>
         <w:pStyle w:val="Bibliography"/>
@@ -20209,7 +20406,7 @@
       <w:r>
         <w:t xml:space="preserve"> </w:t>
       </w:r>
-      <w:hyperlink r:id="rId76">
+      <w:hyperlink r:id="rId80">
         <w:r>
           <w:rPr>
             <w:rStyle w:val="Hyperlink"/>
@@ -20221,8 +20418,8 @@
         <w:t xml:space="preserve">.</w:t>
       </w:r>
     </w:p>
-    <w:bookmarkEnd w:id="77"/>
-    <w:bookmarkStart w:id="79" w:name="ref-bowers2003"/>
+    <w:bookmarkEnd w:id="81"/>
+    <w:bookmarkStart w:id="83" w:name="ref-bowers2003"/>
     <w:p>
       <w:pPr>
         <w:pStyle w:val="Bibliography"/>
@@ -20255,7 +20452,7 @@
       <w:r>
         <w:t xml:space="preserve"> </w:t>
       </w:r>
-      <w:hyperlink r:id="rId78">
+      <w:hyperlink r:id="rId82">
         <w:r>
           <w:rPr>
             <w:rStyle w:val="Hyperlink"/>
@@ -20267,8 +20464,8 @@
         <w:t xml:space="preserve">.</w:t>
       </w:r>
     </w:p>
-    <w:bookmarkEnd w:id="79"/>
-    <w:bookmarkStart w:id="81" w:name="ref-dallas2025pid"/>
+    <w:bookmarkEnd w:id="83"/>
+    <w:bookmarkStart w:id="85" w:name="ref-dallas2025pid"/>
     <w:p>
       <w:pPr>
         <w:pStyle w:val="Bibliography"/>
@@ -20297,7 +20494,7 @@
       <w:r>
         <w:t xml:space="preserve"> </w:t>
       </w:r>
-      <w:hyperlink r:id="rId80">
+      <w:hyperlink r:id="rId84">
         <w:r>
           <w:rPr>
             <w:rStyle w:val="Hyperlink"/>
@@ -20309,8 +20506,8 @@
         <w:t xml:space="preserve">.</w:t>
       </w:r>
     </w:p>
-    <w:bookmarkEnd w:id="81"/>
-    <w:bookmarkStart w:id="83" w:name="ref-nyc2024roosevelt"/>
+    <w:bookmarkEnd w:id="85"/>
+    <w:bookmarkStart w:id="87" w:name="ref-nyc2024roosevelt"/>
     <w:p>
       <w:pPr>
         <w:pStyle w:val="Bibliography"/>
@@ -20375,7 +20572,7 @@
       <w:r>
         <w:t xml:space="preserve"> </w:t>
       </w:r>
-      <w:hyperlink r:id="rId82">
+      <w:hyperlink r:id="rId86">
         <w:r>
           <w:rPr>
             <w:rStyle w:val="Hyperlink"/>
@@ -20387,8 +20584,8 @@
         <w:t xml:space="preserve">.</w:t>
       </w:r>
     </w:p>
-    <w:bookmarkEnd w:id="83"/>
-    <w:bookmarkStart w:id="85" w:name="ref-cook2011"/>
+    <w:bookmarkEnd w:id="87"/>
+    <w:bookmarkStart w:id="89" w:name="ref-cook2011"/>
     <w:p>
       <w:pPr>
         <w:pStyle w:val="Bibliography"/>
@@ -20430,7 +20627,7 @@
       <w:r>
         <w:t xml:space="preserve"> </w:t>
       </w:r>
-      <w:hyperlink r:id="rId84">
+      <w:hyperlink r:id="rId88">
         <w:r>
           <w:rPr>
             <w:rStyle w:val="Hyperlink"/>
@@ -20442,8 +20639,8 @@
         <w:t xml:space="preserve">.</w:t>
       </w:r>
     </w:p>
-    <w:bookmarkEnd w:id="85"/>
-    <w:bookmarkStart w:id="87" w:name="ref-deville1992"/>
+    <w:bookmarkEnd w:id="89"/>
+    <w:bookmarkStart w:id="91" w:name="ref-deville1992"/>
     <w:p>
       <w:pPr>
         <w:pStyle w:val="Bibliography"/>
@@ -20476,7 +20673,7 @@
       <w:r>
         <w:t xml:space="preserve"> </w:t>
       </w:r>
-      <w:hyperlink r:id="rId86">
+      <w:hyperlink r:id="rId90">
         <w:r>
           <w:rPr>
             <w:rStyle w:val="Hyperlink"/>
@@ -20488,8 +20685,8 @@
         <w:t xml:space="preserve">.</w:t>
       </w:r>
     </w:p>
-    <w:bookmarkEnd w:id="87"/>
-    <w:bookmarkStart w:id="89" w:name="ref-guerette2009"/>
+    <w:bookmarkEnd w:id="91"/>
+    <w:bookmarkStart w:id="93" w:name="ref-guerette2009"/>
     <w:p>
       <w:pPr>
         <w:pStyle w:val="Bibliography"/>
@@ -20522,7 +20719,7 @@
       <w:r>
         <w:t xml:space="preserve"> </w:t>
       </w:r>
-      <w:hyperlink r:id="rId88">
+      <w:hyperlink r:id="rId92">
         <w:r>
           <w:rPr>
             <w:rStyle w:val="Hyperlink"/>
@@ -20534,8 +20731,8 @@
         <w:t xml:space="preserve">.</w:t>
       </w:r>
     </w:p>
-    <w:bookmarkEnd w:id="89"/>
-    <w:bookmarkStart w:id="91" w:name="ref-huangfu2018"/>
+    <w:bookmarkEnd w:id="93"/>
+    <w:bookmarkStart w:id="95" w:name="ref-huangfu2018"/>
     <w:p>
       <w:pPr>
         <w:pStyle w:val="Bibliography"/>
@@ -20568,7 +20765,7 @@
       <w:r>
         <w:t xml:space="preserve"> </w:t>
       </w:r>
-      <w:hyperlink r:id="rId90">
+      <w:hyperlink r:id="rId94">
         <w:r>
           <w:rPr>
             <w:rStyle w:val="Hyperlink"/>
@@ -20580,8 +20777,8 @@
         <w:t xml:space="preserve">.</w:t>
       </w:r>
     </w:p>
-    <w:bookmarkEnd w:id="91"/>
-    <w:bookmarkStart w:id="93" w:name="ref-kulldorff1997"/>
+    <w:bookmarkEnd w:id="95"/>
+    <w:bookmarkStart w:id="97" w:name="ref-kulldorff1997"/>
     <w:p>
       <w:pPr>
         <w:pStyle w:val="Bibliography"/>
@@ -20614,7 +20811,7 @@
       <w:r>
         <w:t xml:space="preserve"> </w:t>
       </w:r>
-      <w:hyperlink r:id="rId92">
+      <w:hyperlink r:id="rId96">
         <w:r>
           <w:rPr>
             <w:rStyle w:val="Hyperlink"/>
@@ -20626,8 +20823,8 @@
         <w:t xml:space="preserve">.</w:t>
       </w:r>
     </w:p>
-    <w:bookmarkEnd w:id="93"/>
-    <w:bookmarkStart w:id="95" w:name="ref-macdonald2010"/>
+    <w:bookmarkEnd w:id="97"/>
+    <w:bookmarkStart w:id="99" w:name="ref-macdonald2010"/>
     <w:p>
       <w:pPr>
         <w:pStyle w:val="Bibliography"/>
@@ -20660,7 +20857,7 @@
       <w:r>
         <w:t xml:space="preserve"> </w:t>
       </w:r>
-      <w:hyperlink r:id="rId94">
+      <w:hyperlink r:id="rId98">
         <w:r>
           <w:rPr>
             <w:rStyle w:val="Hyperlink"/>
@@ -20672,8 +20869,8 @@
         <w:t xml:space="preserve">.</w:t>
       </w:r>
     </w:p>
-    <w:bookmarkEnd w:id="95"/>
-    <w:bookmarkStart w:id="97" w:name="ref-qns2025"/>
+    <w:bookmarkEnd w:id="99"/>
+    <w:bookmarkStart w:id="101" w:name="ref-qns2025"/>
     <w:p>
       <w:pPr>
         <w:pStyle w:val="Bibliography"/>
@@ -20711,7 +20908,7 @@
       <w:r>
         <w:t xml:space="preserve"> </w:t>
       </w:r>
-      <w:hyperlink r:id="rId96">
+      <w:hyperlink r:id="rId100">
         <w:r>
           <w:rPr>
             <w:rStyle w:val="Hyperlink"/>
@@ -20723,8 +20920,8 @@
         <w:t xml:space="preserve">.</w:t>
       </w:r>
     </w:p>
-    <w:bookmarkEnd w:id="97"/>
-    <w:bookmarkStart w:id="99" w:name="ref-queenseagle2024"/>
+    <w:bookmarkEnd w:id="101"/>
+    <w:bookmarkStart w:id="103" w:name="ref-queenseagle2024"/>
     <w:p>
       <w:pPr>
         <w:pStyle w:val="Bibliography"/>
@@ -20750,7 +20947,7 @@
       <w:r>
         <w:t xml:space="preserve"> </w:t>
       </w:r>
-      <w:hyperlink r:id="rId98">
+      <w:hyperlink r:id="rId102">
         <w:r>
           <w:rPr>
             <w:rStyle w:val="Hyperlink"/>
@@ -20762,8 +20959,8 @@
         <w:t xml:space="preserve">.</w:t>
       </w:r>
     </w:p>
-    <w:bookmarkEnd w:id="99"/>
-    <w:bookmarkStart w:id="101" w:name="ref-robbins2021"/>
+    <w:bookmarkEnd w:id="103"/>
+    <w:bookmarkStart w:id="105" w:name="ref-robbins2021"/>
     <w:p>
       <w:pPr>
         <w:pStyle w:val="Bibliography"/>
@@ -20805,7 +21002,7 @@
       <w:r>
         <w:t xml:space="preserve"> </w:t>
       </w:r>
-      <w:hyperlink r:id="rId100">
+      <w:hyperlink r:id="rId104">
         <w:r>
           <w:rPr>
             <w:rStyle w:val="Hyperlink"/>
@@ -20817,8 +21014,8 @@
         <w:t xml:space="preserve">.</w:t>
       </w:r>
     </w:p>
-    <w:bookmarkEnd w:id="101"/>
-    <w:bookmarkStart w:id="103" w:name="ref-robbins2017"/>
+    <w:bookmarkEnd w:id="105"/>
+    <w:bookmarkStart w:id="107" w:name="ref-robbins2017"/>
     <w:p>
       <w:pPr>
         <w:pStyle w:val="Bibliography"/>
@@ -20851,7 +21048,7 @@
       <w:r>
         <w:t xml:space="preserve"> </w:t>
       </w:r>
-      <w:hyperlink r:id="rId102">
+      <w:hyperlink r:id="rId106">
         <w:r>
           <w:rPr>
             <w:rStyle w:val="Hyperlink"/>
@@ -20863,8 +21060,8 @@
         <w:t xml:space="preserve">.</w:t>
       </w:r>
     </w:p>
-    <w:bookmarkEnd w:id="103"/>
-    <w:bookmarkStart w:id="105" w:name="ref-saunders2015"/>
+    <w:bookmarkEnd w:id="107"/>
+    <w:bookmarkStart w:id="109" w:name="ref-saunders2015"/>
     <w:p>
       <w:pPr>
         <w:pStyle w:val="Bibliography"/>
@@ -20897,7 +21094,7 @@
       <w:r>
         <w:t xml:space="preserve"> </w:t>
       </w:r>
-      <w:hyperlink r:id="rId104">
+      <w:hyperlink r:id="rId108">
         <w:r>
           <w:rPr>
             <w:rStyle w:val="Hyperlink"/>
@@ -20909,8 +21106,8 @@
         <w:t xml:space="preserve">.</w:t>
       </w:r>
     </w:p>
-    <w:bookmarkEnd w:id="105"/>
-    <w:bookmarkStart w:id="107" w:name="ref-shirabe2005"/>
+    <w:bookmarkEnd w:id="109"/>
+    <w:bookmarkStart w:id="111" w:name="ref-shirabe2005"/>
     <w:p>
       <w:pPr>
         <w:pStyle w:val="Bibliography"/>
@@ -20943,7 +21140,7 @@
       <w:r>
         <w:t xml:space="preserve"> </w:t>
       </w:r>
-      <w:hyperlink r:id="rId106">
+      <w:hyperlink r:id="rId110">
         <w:r>
           <w:rPr>
             <w:rStyle w:val="Hyperlink"/>
@@ -20955,8 +21152,8 @@
         <w:t xml:space="preserve">.</w:t>
       </w:r>
     </w:p>
-    <w:bookmarkEnd w:id="107"/>
-    <w:bookmarkStart w:id="109" w:name="ref-tango2005"/>
+    <w:bookmarkEnd w:id="111"/>
+    <w:bookmarkStart w:id="113" w:name="ref-tango2005"/>
     <w:p>
       <w:pPr>
         <w:pStyle w:val="Bibliography"/>
@@ -20989,7 +21186,7 @@
       <w:r>
         <w:t xml:space="preserve"> </w:t>
       </w:r>
-      <w:hyperlink r:id="rId108">
+      <w:hyperlink r:id="rId112">
         <w:r>
           <w:rPr>
             <w:rStyle w:val="Hyperlink"/>
@@ -21001,8 +21198,8 @@
         <w:t xml:space="preserve">.</w:t>
       </w:r>
     </w:p>
-    <w:bookmarkEnd w:id="109"/>
-    <w:bookmarkStart w:id="111" w:name="ref-labreport2026"/>
+    <w:bookmarkEnd w:id="113"/>
+    <w:bookmarkStart w:id="115" w:name="ref-labreport2026"/>
     <w:p>
       <w:pPr>
         <w:pStyle w:val="Bibliography"/>
@@ -21031,7 +21228,7 @@
       <w:r>
         <w:t xml:space="preserve"> </w:t>
       </w:r>
-      <w:hyperlink r:id="rId110">
+      <w:hyperlink r:id="rId114">
         <w:r>
           <w:rPr>
             <w:rStyle w:val="Hyperlink"/>
@@ -21043,8 +21240,8 @@
         <w:t xml:space="preserve">.</w:t>
       </w:r>
     </w:p>
-    <w:bookmarkEnd w:id="111"/>
-    <w:bookmarkStart w:id="113" w:name="ref-validi2022"/>
+    <w:bookmarkEnd w:id="115"/>
+    <w:bookmarkStart w:id="117" w:name="ref-validi2022"/>
     <w:p>
       <w:pPr>
         <w:pStyle w:val="Bibliography"/>
@@ -21077,7 +21274,7 @@
       <w:r>
         <w:t xml:space="preserve"> </w:t>
       </w:r>
-      <w:hyperlink r:id="rId112">
+      <w:hyperlink r:id="rId116">
         <w:r>
           <w:rPr>
             <w:rStyle w:val="Hyperlink"/>
@@ -21089,8 +21286,8 @@
         <w:t xml:space="preserve">.</w:t>
       </w:r>
     </w:p>
-    <w:bookmarkEnd w:id="113"/>
-    <w:bookmarkStart w:id="115" w:name="ref-wheeler2019pmed"/>
+    <w:bookmarkEnd w:id="117"/>
+    <w:bookmarkStart w:id="119" w:name="ref-wheeler2019pmed"/>
     <w:p>
       <w:pPr>
         <w:pStyle w:val="Bibliography"/>
@@ -21123,7 +21320,7 @@
       <w:r>
         <w:t xml:space="preserve"> </w:t>
       </w:r>
-      <w:hyperlink r:id="rId114">
+      <w:hyperlink r:id="rId118">
         <w:r>
           <w:rPr>
             <w:rStyle w:val="Hyperlink"/>
@@ -21135,8 +21332,8 @@
         <w:t xml:space="preserve">.</w:t>
       </w:r>
     </w:p>
-    <w:bookmarkEnd w:id="115"/>
-    <w:bookmarkStart w:id="117" w:name="ref-wheeler2024compstat"/>
+    <w:bookmarkEnd w:id="119"/>
+    <w:bookmarkStart w:id="121" w:name="ref-wheeler2024compstat"/>
     <w:p>
       <w:pPr>
         <w:pStyle w:val="Bibliography"/>
@@ -21168,7 +21365,7 @@
       <w:r>
         <w:t xml:space="preserve"> </w:t>
       </w:r>
-      <w:hyperlink r:id="rId116">
+      <w:hyperlink r:id="rId120">
         <w:r>
           <w:rPr>
             <w:rStyle w:val="Hyperlink"/>
@@ -21180,8 +21377,8 @@
         <w:t xml:space="preserve">.</w:t>
       </w:r>
     </w:p>
-    <w:bookmarkEnd w:id="117"/>
-    <w:bookmarkStart w:id="119" w:name="ref-wheeler2018wdd"/>
+    <w:bookmarkEnd w:id="121"/>
+    <w:bookmarkStart w:id="123" w:name="ref-wheeler2018wdd"/>
     <w:p>
       <w:pPr>
         <w:pStyle w:val="Bibliography"/>
@@ -21214,7 +21411,7 @@
       <w:r>
         <w:t xml:space="preserve"> </w:t>
       </w:r>
-      <w:hyperlink r:id="rId118">
+      <w:hyperlink r:id="rId122">
         <w:r>
           <w:rPr>
             <w:rStyle w:val="Hyperlink"/>
@@ -21226,9 +21423,9 @@
         <w:t xml:space="preserve">.</w:t>
       </w:r>
     </w:p>
-    <w:bookmarkEnd w:id="119"/>
-    <w:bookmarkEnd w:id="120"/>
-    <w:bookmarkEnd w:id="121"/>
+    <w:bookmarkEnd w:id="123"/>
+    <w:bookmarkEnd w:id="124"/>
+    <w:bookmarkEnd w:id="125"/>
     <w:sectPr/>
   </w:body>
 </w:document>

</xml_diff>

<commit_message>
Show actual monthly counts in the time series figures
Co-Authored-By: Claude Opus 5.5 <noreply@anthropic.com>
</commit_message>
<xml_diff>
--- a/paper.docx
+++ b/paper.docx
@@ -10033,7 +10033,7 @@
               <w:pStyle w:val="ImageCaption"/>
             </w:pPr>
             <w:r>
-              <w:t xml:space="preserve">Figure 2: Monthly crime in the example world’s treated area and in four controls, each scaled to the treated area’s pre-period volume. Each line is a three-month moving average of monthly counts, computed separately before and after the intervention (dotted line). The treated area’s crime falls 20% after the intervention.</w:t>
+              <w:t xml:space="preserve">Figure 2: Monthly crime in the example world’s treated area and in four controls, each scaled to the treated area’s pre-period volume. Lines are monthly counts; the dotted line marks the intervention, after which the treated area’s crime falls 20%.</w:t>
             </w:r>
           </w:p>
           <w:bookmarkEnd w:id="39"/>
@@ -12520,7 +12520,7 @@
               <w:pStyle w:val="ImageCaption"/>
             </w:pPr>
             <w:r>
-              <w:t xml:space="preserve">Figure 4: Monthly crime in the RedBird PID and three controls: the contiguous control area, the scan’s network circle, and microsynth. Each line is a three-month moving average of monthly counts, computed separately before and after January 1, 2026 (dotted line).</w:t>
+              <w:t xml:space="preserve">Figure 4: Monthly crime in the RedBird PID and three controls: the contiguous control area, the scan’s network circle, and microsynth. Lines are monthly counts (microsynth’s are weighted sums); the dotted line marks January 1, 2026.</w:t>
             </w:r>
           </w:p>
           <w:bookmarkEnd w:id="51"/>
@@ -15041,7 +15041,7 @@
               <w:pStyle w:val="ImageCaption"/>
             </w:pPr>
             <w:r>
-              <w:t xml:space="preserve">Figure 7: Monthly crime on the Roosevelt Avenue corridor and three controls: the contiguous control area, the scan’s network circle, and microsynth. Each line is a three-month moving average of monthly counts, computed separately before and after October 15, 2024 (dotted line).</w:t>
+              <w:t xml:space="preserve">Figure 7: Monthly crime on the Roosevelt Avenue corridor and three controls: the contiguous control area, the scan’s network circle, and microsynth. Lines are monthly counts (microsynth’s are weighted sums); the dotted line marks October 15, 2024.</w:t>
             </w:r>
           </w:p>
           <w:bookmarkEnd w:id="65"/>
@@ -16961,18 +16961,6 @@
       </w:r>
       <w:r>
         <w:t xml:space="preserve">54 and 39 in the first two months.</w:t>
-      </w:r>
-      <w:r>
-        <w:t xml:space="preserve"> </w:t>
-      </w:r>
-      <w:r>
-        <w:t xml:space="preserve">(The moving averages are computed separately on each side of the launch, so</w:t>
-      </w:r>
-      <w:r>
-        <w:t xml:space="preserve"> </w:t>
-      </w:r>
-      <w:r>
-        <w:t xml:space="preserve">the averages just before it still include the summer peak.)</w:t>
       </w:r>
     </w:p>
     <w:p>

</xml_diff>

<commit_message>
Add Queens-wide microsynth weights panel to the Roosevelt Ave map
Co-Authored-By: Claude Opus 5.5 <noreply@anthropic.com>
</commit_message>
<xml_diff>
--- a/paper.docx
+++ b/paper.docx
@@ -14911,7 +14911,7 @@
             <w:r>
               <w:drawing>
                 <wp:inline>
-                  <wp:extent cx="5334000" cy="5986284"/>
+                  <wp:extent cx="5334000" cy="4776572"/>
                   <wp:effectExtent b="0" l="0" r="0" t="0"/>
                   <wp:docPr descr="" title="" id="59" name="Picture"/>
                   <a:graphic>
@@ -14932,7 +14932,7 @@
                         <pic:spPr bwMode="auto">
                           <a:xfrm>
                             <a:off x="0" y="0"/>
-                            <a:ext cx="5334000" cy="5986284"/>
+                            <a:ext cx="5334000" cy="4776572"/>
                           </a:xfrm>
                           <a:prstGeom prst="rect">
                             <a:avLst/>
@@ -14961,7 +14961,7 @@
               <w:pStyle w:val="ImageCaption"/>
             </w:pPr>
             <w:r>
-              <w:t xml:space="preserve">Figure 6: Roosevelt Avenue from 74th to 111th Street (black), its quarter-mile buffer (dashed), and the control areas for violent and property crime: the contiguous control (blue fill) and the pure scan’s network circle (aqua outline). Gray lines are census blocks.</w:t>
+              <w:t xml:space="preserve">Figure 6: Roosevelt Avenue from 74th to 111th Street (black), its quarter-mile buffer (dashed), and the control areas for violent and property crime: the contiguous control (blue fill) and the pure scan’s network circle (aqua outline). Gray lines are census blocks. The right panel shows microsynth’s weights for violent crime across all of Queens (darker is larger).</w:t>
             </w:r>
           </w:p>
           <w:bookmarkEnd w:id="61"/>
@@ -16821,7 +16821,37 @@
         <w:t xml:space="preserve"> </w:t>
       </w:r>
       <w:r>
-        <w:t xml:space="preserve">larger and, for property crime, in a different part of the borough. The</w:t>
+        <w:t xml:space="preserve">larger and, for property crime, in a different part of the borough.</w:t>
+      </w:r>
+      <w:r>
+        <w:t xml:space="preserve"> </w:t>
+      </w:r>
+      <w:r>
+        <w:t xml:space="preserve">Microsynth again spreads its weight across the whole borough, over</w:t>
+      </w:r>
+      <w:r>
+        <w:t xml:space="preserve"> </w:t>
+      </w:r>
+      <w:r>
+        <w:t xml:space="preserve">12,195 of the</w:t>
+      </w:r>
+      <w:r>
+        <w:t xml:space="preserve"> </w:t>
+      </w:r>
+      <w:r>
+        <w:t xml:space="preserve">13,595 candidate blocks for</w:t>
+      </w:r>
+      <w:r>
+        <w:t xml:space="preserve"> </w:t>
+      </w:r>
+      <w:r>
+        <w:t xml:space="preserve">violent crime and 9,796</w:t>
+      </w:r>
+      <w:r>
+        <w:t xml:space="preserve"> </w:t>
+      </w:r>
+      <w:r>
+        <w:t xml:space="preserve">of 13,582 for property crime. The</w:t>
       </w:r>
       <w:r>
         <w:t xml:space="preserve"> </w:t>

</xml_diff>